<commit_message>
Send Email For Event
</commit_message>
<xml_diff>
--- a/Proposta progetto finale di Ingegneria del Software  .docx
+++ b/Proposta progetto finale di Ingegneria del Software  .docx
@@ -1,128 +1,616 @@
 
 <file path=word/document.xml><?xml version="1.0" encoding="utf-8"?>
-<w:document xmlns:wpc="http://schemas.microsoft.com/office/word/2010/wordprocessingCanvas" xmlns:cx="http://schemas.microsoft.com/office/drawing/2014/chartex" xmlns:cx1="http://schemas.microsoft.com/office/drawing/2015/9/8/chartex" xmlns:cx2="http://schemas.microsoft.com/office/drawing/2015/10/21/chartex" xmlns:cx3="http://schemas.microsoft.com/office/drawing/2016/5/9/chartex" xmlns:cx4="http://schemas.microsoft.com/office/drawing/2016/5/10/chartex" xmlns:cx5="http://schemas.microsoft.com/office/drawing/2016/5/11/chartex" xmlns:cx6="http://schemas.microsoft.com/office/drawing/2016/5/12/chartex" xmlns:cx7="http://schemas.microsoft.com/office/drawing/2016/5/13/chartex" xmlns:cx8="http://schemas.microsoft.com/office/drawing/2016/5/14/chartex" xmlns:mc="http://schemas.openxmlformats.org/markup-compatibility/2006" xmlns:aink="http://schemas.microsoft.com/office/drawing/2016/ink" xmlns:am3d="http://schemas.microsoft.com/office/drawing/2017/model3d" xmlns:o="urn:schemas-microsoft-com:office:office" xmlns:oel="http://schemas.microsoft.com/office/2019/extlst" xmlns:r="http://schemas.openxmlformats.org/officeDocument/2006/relationships" xmlns:m="http://schemas.openxmlformats.org/officeDocument/2006/math" xmlns:v="urn:schemas-microsoft-com:vml" xmlns:wp14="http://schemas.microsoft.com/office/word/2010/wordprocessingDrawing" xmlns:wp="http://schemas.openxmlformats.org/drawingml/2006/wordprocessingDrawing" xmlns:w10="urn:schemas-microsoft-com:office:word" xmlns:w="http://schemas.openxmlformats.org/wordprocessingml/2006/main" xmlns:w14="http://schemas.microsoft.com/office/word/2010/wordml" xmlns:w15="http://schemas.microsoft.com/office/word/2012/wordml" xmlns:w16cex="http://schemas.microsoft.com/office/word/2018/wordml/cex" xmlns:w16cid="http://schemas.microsoft.com/office/word/2016/wordml/cid" xmlns:w16="http://schemas.microsoft.com/office/word/2018/wordml" xmlns:w16du="http://schemas.microsoft.com/office/word/2023/wordml/word16du" xmlns:w16sdtdh="http://schemas.microsoft.com/office/word/2020/wordml/sdtdatahash" xmlns:w16se="http://schemas.microsoft.com/office/word/2015/wordml/symex" xmlns:wpg="http://schemas.microsoft.com/office/word/2010/wordprocessingGroup" xmlns:wpi="http://schemas.microsoft.com/office/word/2010/wordprocessingInk" xmlns:wne="http://schemas.microsoft.com/office/word/2006/wordml" xmlns:wps="http://schemas.microsoft.com/office/word/2010/wordprocessingShape" mc:Ignorable="w14 w15 w16se w16cid w16 w16cex w16sdtdh w16du wp14">
+<w:document xmlns:wpc="http://schemas.microsoft.com/office/word/2010/wordprocessingCanvas" xmlns:cx="http://schemas.microsoft.com/office/drawing/2014/chartex" xmlns:cx1="http://schemas.microsoft.com/office/drawing/2015/9/8/chartex" xmlns:cx2="http://schemas.microsoft.com/office/drawing/2015/10/21/chartex" xmlns:cx3="http://schemas.microsoft.com/office/drawing/2016/5/9/chartex" xmlns:cx4="http://schemas.microsoft.com/office/drawing/2016/5/10/chartex" xmlns:cx5="http://schemas.microsoft.com/office/drawing/2016/5/11/chartex" xmlns:cx6="http://schemas.microsoft.com/office/drawing/2016/5/12/chartex" xmlns:cx7="http://schemas.microsoft.com/office/drawing/2016/5/13/chartex" xmlns:cx8="http://schemas.microsoft.com/office/drawing/2016/5/14/chartex" xmlns:mc="http://schemas.openxmlformats.org/markup-compatibility/2006" xmlns:aink="http://schemas.microsoft.com/office/drawing/2016/ink" xmlns:am3d="http://schemas.microsoft.com/office/drawing/2017/model3d" xmlns:o="urn:schemas-microsoft-com:office:office" xmlns:oel="http://schemas.microsoft.com/office/2019/extlst" xmlns:r="http://schemas.openxmlformats.org/officeDocument/2006/relationships" xmlns:m="http://schemas.openxmlformats.org/officeDocument/2006/math" xmlns:v="urn:schemas-microsoft-com:vml" xmlns:wp14="http://schemas.microsoft.com/office/word/2010/wordprocessingDrawing" xmlns:wp="http://schemas.openxmlformats.org/drawingml/2006/wordprocessingDrawing" xmlns:w10="urn:schemas-microsoft-com:office:word" xmlns:w="http://schemas.openxmlformats.org/wordprocessingml/2006/main" xmlns:w14="http://schemas.microsoft.com/office/word/2010/wordml" xmlns:w15="http://schemas.microsoft.com/office/word/2012/wordml" xmlns:w16cex="http://schemas.microsoft.com/office/word/2018/wordml/cex" xmlns:w16cid="http://schemas.microsoft.com/office/word/2016/wordml/cid" xmlns:w16="http://schemas.microsoft.com/office/word/2018/wordml" xmlns:w16du="http://schemas.microsoft.com/office/word/2023/wordml/word16du" xmlns:w16sdtdh="http://schemas.microsoft.com/office/word/2020/wordml/sdtdatahash" xmlns:w16sdtfl="http://schemas.microsoft.com/office/word/2024/wordml/sdtformatlock" xmlns:w16se="http://schemas.microsoft.com/office/word/2015/wordml/symex" xmlns:wpg="http://schemas.microsoft.com/office/word/2010/wordprocessingGroup" xmlns:wpi="http://schemas.microsoft.com/office/word/2010/wordprocessingInk" xmlns:wne="http://schemas.microsoft.com/office/word/2006/wordml" xmlns:wps="http://schemas.microsoft.com/office/word/2010/wordprocessingShape" mc:Ignorable="w14 w15 w16se w16cid w16 w16cex w16sdtdh w16sdtfl w16du wp14">
   <w:body>
     <w:p>
-      <w:r>
+      <w:pPr>
+        <w:pStyle w:val="NormaleWeb"/>
+        <w:jc w:val="both"/>
+        <w:rPr>
+          <w:rFonts w:asciiTheme="minorHAnsi" w:hAnsiTheme="minorHAnsi"/>
+        </w:rPr>
+      </w:pPr>
+      <w:r>
+        <w:rPr>
+          <w:rFonts w:asciiTheme="minorHAnsi" w:hAnsiTheme="minorHAnsi"/>
+        </w:rPr>
         <w:t>Gentile Prof. Salnitri,</w:t>
-      </w:r>
-      <w:r>
-        <w:t xml:space="preserve"> </w:t>
-      </w:r>
-      <w:r>
-        <w:t>sono Even Ciampa, studentessa del III anno di Ingegneria Informatica (IOR).</w:t>
-      </w:r>
-      <w:r>
-        <w:t xml:space="preserve"> </w:t>
-      </w:r>
-      <w:r>
-        <w:t xml:space="preserve">Con la presente desidero ripresentare il progetto definitivo per la prova finale. </w:t>
       </w:r>
     </w:p>
     <w:p>
       <w:pPr>
+        <w:pStyle w:val="NormaleWeb"/>
+        <w:jc w:val="both"/>
+        <w:rPr>
+          <w:rFonts w:asciiTheme="minorHAnsi" w:hAnsiTheme="minorHAnsi"/>
+        </w:rPr>
+      </w:pPr>
+      <w:r>
+        <w:rPr>
+          <w:rFonts w:asciiTheme="minorHAnsi" w:hAnsiTheme="minorHAnsi"/>
+        </w:rPr>
+        <w:t>sono Even Ciampa, studentessa del III anno di Ingegneria Informatica (IOR). Con la presente, desidero ripresentare il progetto definitivo per la prova finale, integrando significative modifiche basate sul feedback ricevuto nella precedente sessione di esame.</w:t>
+      </w:r>
+    </w:p>
+    <w:p>
+      <w:pPr>
+        <w:pStyle w:val="NormaleWeb"/>
+        <w:jc w:val="both"/>
+        <w:rPr>
+          <w:rFonts w:asciiTheme="minorHAnsi" w:hAnsiTheme="minorHAnsi"/>
+        </w:rPr>
+      </w:pPr>
+      <w:r>
+        <w:rPr>
+          <w:rFonts w:asciiTheme="minorHAnsi" w:hAnsiTheme="minorHAnsi"/>
+        </w:rPr>
+        <w:t>Le migliorie riguardano principalmente l'ampliamento delle funzionalità tramite l'integrazione del design pattern Decorator, che ha reso le recensioni più versatili e personalizzabili. Inoltre, ho ridefinito e ottimizzato la struttura dei ruoli all'interno della piattaforma, rendendola più funzionale e adatta alle esigenze di un'agenzia di organizzazione eventi, contesto in cui ho l'opportunità di mettere immediatamente a frutto queste innovazioni.</w:t>
+      </w:r>
+    </w:p>
+    <w:p>
+      <w:pPr>
+        <w:jc w:val="both"/>
+      </w:pPr>
+      <w:r>
         <w:rPr>
           <w:b/>
           <w:bCs/>
         </w:rPr>
-      </w:pPr>
+        <w:t>Ambito del progetto</w:t>
+      </w:r>
+      <w:r>
+        <w:t>:</w:t>
+      </w:r>
     </w:p>
     <w:p>
+      <w:pPr>
+        <w:jc w:val="both"/>
+      </w:pPr>
+      <w:r>
+        <w:t xml:space="preserve">L’idea del progetto nasce dalla volontà di stimolare l’interazione sociale e culturale tra i giovani attraverso una piattaforma online che faciliti la scoperta e la prenotazione di un'ampia gamma di eventi. Questi possono variare da mostre d’arte e laboratori culturali, a incontri tematici e serate di intrattenimento in diverse location, inclusi eventi in edifici storici o esperienze ricreative moderne. </w:t>
+      </w:r>
+    </w:p>
+    <w:p>
+      <w:pPr>
+        <w:jc w:val="both"/>
+      </w:pPr>
+      <w:r>
+        <w:t xml:space="preserve">L'obiettivo principale è rendere più accessibile l'organizzazione e la partecipazione a queste attività, promuovendo una </w:t>
+      </w:r>
       <w:r>
         <w:rPr>
           <w:b/>
           <w:bCs/>
         </w:rPr>
-        <w:t xml:space="preserve">Ambito del </w:t>
+        <w:t>connessione</w:t>
+      </w:r>
+      <w:r>
+        <w:t xml:space="preserve"> diretta tra i giovani utenti e i gestori degli spazi che ospitano gli eventi. La piattaforma intende offrire una soluzione integrata che </w:t>
       </w:r>
       <w:r>
         <w:rPr>
           <w:b/>
           <w:bCs/>
         </w:rPr>
-        <w:t>p</w:t>
+        <w:t>elimini la necessità di contatti preliminari fisici con le strutture</w:t>
+      </w:r>
+      <w:r>
+        <w:t xml:space="preserve">, </w:t>
       </w:r>
       <w:r>
         <w:rPr>
           <w:b/>
           <w:bCs/>
         </w:rPr>
-        <w:t>rogetto</w:t>
-      </w:r>
-      <w:r>
-        <w:t>:</w:t>
+        <w:t>ampliando così la rete</w:t>
+      </w:r>
+      <w:r>
+        <w:t xml:space="preserve"> di siti disponibili per eventi, e rendendo il processo di organizzazione e partecipazione semplice ed efficace. Questo permetterà non solo di </w:t>
+      </w:r>
+      <w:r>
+        <w:rPr>
+          <w:b/>
+          <w:bCs/>
+        </w:rPr>
+        <w:t>arricchire</w:t>
+      </w:r>
+      <w:r>
+        <w:t xml:space="preserve"> l'offerta culturale, ma anche di incentivare incontri sociali e di svago, rispondendo in modo flessibile alle diverse esigenze e interessi dei giovani.</w:t>
       </w:r>
     </w:p>
     <w:p>
       <w:pPr>
         <w:jc w:val="both"/>
-      </w:pPr>
-      <w:r>
-        <w:t>L’idea nasce dal desiderio di favorire la partecipazione del pubblico, in particolare dei giovani, ad attività culturali come mostre d’arte, laboratori, proiezioni, incontri a tema ed eventi in edifici storici. L’obiettivo è sviluppare una piattaforma online che renda agevole la scoperta, la prenotazione e la fruizione di esperienze culturali senza richiedere necessariamente un contatto fisico preliminare con le strutture.</w:t>
-      </w:r>
+        <w:rPr>
+          <w:b/>
+          <w:bCs/>
+        </w:rPr>
+      </w:pPr>
     </w:p>
     <w:p>
       <w:pPr>
+        <w:spacing w:before="100" w:beforeAutospacing="1" w:after="100" w:afterAutospacing="1"/>
         <w:jc w:val="both"/>
-        <w:rPr>
+        <w:outlineLvl w:val="2"/>
+        <w:rPr>
+          <w:rFonts w:eastAsia="Times New Roman" w:cs="Times New Roman"/>
           <w:b/>
           <w:bCs/>
-        </w:rPr>
-      </w:pPr>
+          <w:kern w:val="0"/>
+          <w:sz w:val="27"/>
+          <w:szCs w:val="27"/>
+          <w:lang w:eastAsia="it-IT"/>
+          <w14:ligatures w14:val="none"/>
+        </w:rPr>
+      </w:pPr>
+      <w:r>
+        <w:rPr>
+          <w:rFonts w:eastAsia="Times New Roman" w:cs="Times New Roman"/>
+          <w:b/>
+          <w:bCs/>
+          <w:kern w:val="0"/>
+          <w:sz w:val="27"/>
+          <w:szCs w:val="27"/>
+          <w:lang w:eastAsia="it-IT"/>
+          <w14:ligatures w14:val="none"/>
+        </w:rPr>
+        <w:t>Funzionalità Principali</w:t>
+      </w:r>
     </w:p>
     <w:p>
       <w:pPr>
+        <w:numPr>
+          <w:ilvl w:val="0"/>
+          <w:numId w:val="10"/>
+        </w:numPr>
+        <w:spacing w:before="100" w:beforeAutospacing="1" w:after="100" w:afterAutospacing="1"/>
         <w:jc w:val="both"/>
-      </w:pPr>
-      <w:r>
-        <w:rPr>
+        <w:rPr>
+          <w:rFonts w:eastAsia="Times New Roman" w:cs="Times New Roman"/>
+          <w:kern w:val="0"/>
+          <w:lang w:eastAsia="it-IT"/>
+          <w14:ligatures w14:val="none"/>
+        </w:rPr>
+      </w:pPr>
+      <w:r>
+        <w:rPr>
+          <w:rFonts w:eastAsia="Times New Roman" w:cs="Times New Roman"/>
           <w:b/>
           <w:bCs/>
-        </w:rPr>
-        <w:t>Funzionalità</w:t>
-      </w:r>
-      <w:r>
-        <w:rPr>
+          <w:kern w:val="0"/>
+          <w:lang w:eastAsia="it-IT"/>
+          <w14:ligatures w14:val="none"/>
+        </w:rPr>
+        <w:t>Visualizzazione Eventi:</w:t>
+      </w:r>
+      <w:r>
+        <w:rPr>
+          <w:rFonts w:eastAsia="Times New Roman" w:cs="Times New Roman"/>
+          <w:kern w:val="0"/>
+          <w:lang w:eastAsia="it-IT"/>
+          <w14:ligatures w14:val="none"/>
+        </w:rPr>
+        <w:t xml:space="preserve"> Gli utenti potranno consultare un catalogo di eventi, leggendo descrizioni dettagliate, esplorando le date disponibili e gli spazi ospitanti, e</w:t>
+      </w:r>
+      <w:r>
+        <w:rPr>
+          <w:rFonts w:eastAsia="Times New Roman" w:cs="Times New Roman"/>
+          <w:kern w:val="0"/>
+          <w:lang w:eastAsia="it-IT"/>
+          <w14:ligatures w14:val="none"/>
+        </w:rPr>
+        <w:t xml:space="preserve"> </w:t>
+      </w:r>
+      <w:r>
+        <w:rPr>
+          <w:rFonts w:eastAsia="Times New Roman" w:cs="Times New Roman"/>
+          <w:kern w:val="0"/>
+          <w:lang w:eastAsia="it-IT"/>
+          <w14:ligatures w14:val="none"/>
+        </w:rPr>
+        <w:t>conoscendo meglio gli organizzatori.</w:t>
+      </w:r>
+    </w:p>
+    <w:p>
+      <w:pPr>
+        <w:pStyle w:val="NormaleWeb"/>
+        <w:numPr>
+          <w:ilvl w:val="0"/>
+          <w:numId w:val="10"/>
+        </w:numPr>
+        <w:jc w:val="both"/>
+        <w:rPr>
+          <w:rFonts w:asciiTheme="minorHAnsi" w:hAnsiTheme="minorHAnsi"/>
+        </w:rPr>
+      </w:pPr>
+      <w:r>
+        <w:rPr>
+          <w:rStyle w:val="Enfasigrassetto"/>
+          <w:rFonts w:asciiTheme="minorHAnsi" w:eastAsiaTheme="majorEastAsia" w:hAnsiTheme="minorHAnsi"/>
+        </w:rPr>
+        <w:t>Recensioni Eventi:</w:t>
+      </w:r>
+      <w:r>
+        <w:rPr>
+          <w:rFonts w:asciiTheme="minorHAnsi" w:hAnsiTheme="minorHAnsi"/>
+        </w:rPr>
+        <w:t xml:space="preserve"> Gli utenti potranno scrivere recensioni personalizzate sugli eventi a cui hanno partecipato, utilizzando funzioni avanzate come l'aggiunta di tag e l'opzione di anonimato, grazie all'adozione del design pattern Decorator. Queste funzionalità sono pensate per arricchire l'esperienza degli utenti e incentivare un feedback costruttivo.</w:t>
+      </w:r>
+    </w:p>
+    <w:p>
+      <w:pPr>
+        <w:pStyle w:val="NormaleWeb"/>
+        <w:numPr>
+          <w:ilvl w:val="0"/>
+          <w:numId w:val="10"/>
+        </w:numPr>
+        <w:jc w:val="both"/>
+        <w:rPr>
+          <w:rFonts w:asciiTheme="minorHAnsi" w:hAnsiTheme="minorHAnsi"/>
+        </w:rPr>
+      </w:pPr>
+      <w:r>
+        <w:rPr>
+          <w:rFonts w:asciiTheme="minorHAnsi" w:hAnsiTheme="minorHAnsi"/>
+        </w:rPr>
+        <w:t xml:space="preserve"> </w:t>
+      </w:r>
+      <w:r>
+        <w:rPr>
+          <w:rStyle w:val="Enfasigrassetto"/>
+          <w:rFonts w:asciiTheme="minorHAnsi" w:eastAsiaTheme="majorEastAsia" w:hAnsiTheme="minorHAnsi"/>
+        </w:rPr>
+        <w:t>Profili degli Organizzatori:</w:t>
+      </w:r>
+      <w:r>
+        <w:rPr>
+          <w:rFonts w:asciiTheme="minorHAnsi" w:hAnsiTheme="minorHAnsi"/>
+        </w:rPr>
+        <w:t xml:space="preserve"> La piattaforma consente di consultare dettagliatamente i profili dei promotori degli eventi, offrendo agli utenti la possibilità di conoscere meglio chi organizza gli eventi e la loro reputazione. Questo aiuta a costruire fiducia e trasparenza tra gli utenti e gli organizzatori.</w:t>
+      </w:r>
+    </w:p>
+    <w:p>
+      <w:pPr>
+        <w:numPr>
+          <w:ilvl w:val="0"/>
+          <w:numId w:val="10"/>
+        </w:numPr>
+        <w:spacing w:before="100" w:beforeAutospacing="1" w:after="100" w:afterAutospacing="1"/>
+        <w:jc w:val="both"/>
+        <w:rPr>
+          <w:rFonts w:eastAsia="Times New Roman" w:cs="Times New Roman"/>
+          <w:kern w:val="0"/>
+          <w:lang w:eastAsia="it-IT"/>
+          <w14:ligatures w14:val="none"/>
+        </w:rPr>
+      </w:pPr>
+      <w:r>
+        <w:rPr>
+          <w:rFonts w:eastAsia="Times New Roman" w:cs="Times New Roman"/>
           <w:b/>
           <w:bCs/>
-        </w:rPr>
-        <w:t xml:space="preserve"> p</w:t>
-      </w:r>
-      <w:r>
-        <w:rPr>
+          <w:kern w:val="0"/>
+          <w:lang w:eastAsia="it-IT"/>
+          <w14:ligatures w14:val="none"/>
+        </w:rPr>
+        <w:t>Gestione Prenotazioni:</w:t>
+      </w:r>
+      <w:r>
+        <w:rPr>
+          <w:rFonts w:eastAsia="Times New Roman" w:cs="Times New Roman"/>
+          <w:kern w:val="0"/>
+          <w:lang w:eastAsia="it-IT"/>
+          <w14:ligatures w14:val="none"/>
+        </w:rPr>
+        <w:t xml:space="preserve"> Gli utenti possono prenotare facilmente la loro partecipazione agli eventi attraverso l'interfaccia online.</w:t>
+      </w:r>
+    </w:p>
+    <w:p>
+      <w:pPr>
+        <w:numPr>
+          <w:ilvl w:val="0"/>
+          <w:numId w:val="10"/>
+        </w:numPr>
+        <w:spacing w:before="100" w:beforeAutospacing="1" w:after="100" w:afterAutospacing="1"/>
+        <w:jc w:val="both"/>
+        <w:rPr>
+          <w:rFonts w:eastAsia="Times New Roman" w:cs="Times New Roman"/>
+          <w:kern w:val="0"/>
+          <w:lang w:eastAsia="it-IT"/>
+          <w14:ligatures w14:val="none"/>
+        </w:rPr>
+      </w:pPr>
+      <w:r>
+        <w:rPr>
+          <w:rFonts w:eastAsia="Times New Roman" w:cs="Times New Roman"/>
           <w:b/>
           <w:bCs/>
-        </w:rPr>
-        <w:t>rincipali</w:t>
-      </w:r>
-      <w:r>
-        <w:t>:</w:t>
+          <w:kern w:val="0"/>
+          <w:lang w:eastAsia="it-IT"/>
+          <w14:ligatures w14:val="none"/>
+        </w:rPr>
+        <w:t>Ruoli e Gestione Utenti:</w:t>
+      </w:r>
+      <w:r>
+        <w:rPr>
+          <w:rFonts w:eastAsia="Times New Roman" w:cs="Times New Roman"/>
+          <w:kern w:val="0"/>
+          <w:lang w:eastAsia="it-IT"/>
+          <w14:ligatures w14:val="none"/>
+        </w:rPr>
+        <w:t xml:space="preserve"> Il sistema distingue tra vari ruoli: clienti, promotori, revisori, e amministratori. I revisori, tipicamente rappresentanti dei locali, possono modificare lo stato degli eventi proposti dai promotori, accettandoli, richiedendone la revisione o riportandoli allo stato di bozza. I promotori hanno il compito di organizzare e proporre </w:t>
+      </w:r>
+      <w:r>
+        <w:rPr>
+          <w:rFonts w:eastAsia="Times New Roman" w:cs="Times New Roman"/>
+          <w:kern w:val="0"/>
+          <w:lang w:eastAsia="it-IT"/>
+          <w14:ligatures w14:val="none"/>
+        </w:rPr>
+        <w:lastRenderedPageBreak/>
+        <w:t>eventi, mentre gli amministratori controllano la pubblicazione degli eventi, gestiscono le prenotazioni e moderano le recensioni.</w:t>
       </w:r>
     </w:p>
     <w:p>
       <w:pPr>
         <w:numPr>
           <w:ilvl w:val="0"/>
-          <w:numId w:val="5"/>
+          <w:numId w:val="10"/>
+        </w:numPr>
+        <w:spacing w:before="100" w:beforeAutospacing="1" w:after="100" w:afterAutospacing="1"/>
+        <w:jc w:val="both"/>
+        <w:rPr>
+          <w:rFonts w:eastAsia="Times New Roman" w:cs="Times New Roman"/>
+          <w:kern w:val="0"/>
+          <w:lang w:eastAsia="it-IT"/>
+          <w14:ligatures w14:val="none"/>
+        </w:rPr>
+      </w:pPr>
+      <w:r>
+        <w:rPr>
+          <w:rFonts w:eastAsia="Times New Roman" w:cs="Times New Roman"/>
+          <w:b/>
+          <w:bCs/>
+          <w:kern w:val="0"/>
+          <w:lang w:eastAsia="it-IT"/>
+          <w14:ligatures w14:val="none"/>
+        </w:rPr>
+        <w:t>Comunicazione Interna:</w:t>
+      </w:r>
+      <w:r>
+        <w:rPr>
+          <w:rFonts w:eastAsia="Times New Roman" w:cs="Times New Roman"/>
+          <w:kern w:val="0"/>
+          <w:lang w:eastAsia="it-IT"/>
+          <w14:ligatures w14:val="none"/>
+        </w:rPr>
+        <w:t xml:space="preserve"> Un sistema di messaggistica integrato facilita la comunicazione diretta tra i vari ruoli, in particolare tra promotori e revisori per le modifiche agli eventi.</w:t>
+      </w:r>
+    </w:p>
+    <w:p>
+      <w:pPr>
+        <w:spacing w:before="100" w:beforeAutospacing="1" w:after="100" w:afterAutospacing="1"/>
+        <w:jc w:val="both"/>
+        <w:outlineLvl w:val="2"/>
+        <w:rPr>
+          <w:rFonts w:eastAsia="Times New Roman" w:cs="Times New Roman"/>
+          <w:b/>
+          <w:bCs/>
+          <w:kern w:val="0"/>
+          <w:sz w:val="27"/>
+          <w:szCs w:val="27"/>
+          <w:lang w:eastAsia="it-IT"/>
+          <w14:ligatures w14:val="none"/>
+        </w:rPr>
+      </w:pPr>
+      <w:r>
+        <w:rPr>
+          <w:rFonts w:eastAsia="Times New Roman" w:cs="Times New Roman"/>
+          <w:b/>
+          <w:bCs/>
+          <w:kern w:val="0"/>
+          <w:sz w:val="27"/>
+          <w:szCs w:val="27"/>
+          <w:lang w:eastAsia="it-IT"/>
+          <w14:ligatures w14:val="none"/>
+        </w:rPr>
+        <w:t>Funzionalità per Utenti Specifici</w:t>
+      </w:r>
+    </w:p>
+    <w:p>
+      <w:pPr>
+        <w:numPr>
+          <w:ilvl w:val="0"/>
+          <w:numId w:val="11"/>
+        </w:numPr>
+        <w:spacing w:before="100" w:beforeAutospacing="1" w:after="100" w:afterAutospacing="1"/>
+        <w:jc w:val="both"/>
+        <w:rPr>
+          <w:rFonts w:eastAsia="Times New Roman" w:cs="Times New Roman"/>
+          <w:kern w:val="0"/>
+          <w:lang w:eastAsia="it-IT"/>
+          <w14:ligatures w14:val="none"/>
+        </w:rPr>
+      </w:pPr>
+      <w:r>
+        <w:rPr>
+          <w:rFonts w:eastAsia="Times New Roman" w:cs="Times New Roman"/>
+          <w:b/>
+          <w:bCs/>
+          <w:kern w:val="0"/>
+          <w:lang w:eastAsia="it-IT"/>
+          <w14:ligatures w14:val="none"/>
+        </w:rPr>
+        <w:t>Cliente:</w:t>
+      </w:r>
+      <w:r>
+        <w:rPr>
+          <w:rFonts w:eastAsia="Times New Roman" w:cs="Times New Roman"/>
+          <w:kern w:val="0"/>
+          <w:lang w:eastAsia="it-IT"/>
+          <w14:ligatures w14:val="none"/>
+        </w:rPr>
+        <w:t xml:space="preserve"> Registrazione, consultazione eventi, lettura e scrittura di recensioni personalizzate, gestione prenotazioni.</w:t>
+      </w:r>
+    </w:p>
+    <w:p>
+      <w:pPr>
+        <w:numPr>
+          <w:ilvl w:val="0"/>
+          <w:numId w:val="11"/>
+        </w:numPr>
+        <w:spacing w:before="100" w:beforeAutospacing="1" w:after="100" w:afterAutospacing="1"/>
+        <w:jc w:val="both"/>
+        <w:rPr>
+          <w:rFonts w:eastAsia="Times New Roman" w:cs="Times New Roman"/>
+          <w:kern w:val="0"/>
+          <w:lang w:eastAsia="it-IT"/>
+          <w14:ligatures w14:val="none"/>
+        </w:rPr>
+      </w:pPr>
+      <w:r>
+        <w:rPr>
+          <w:rFonts w:eastAsia="Times New Roman" w:cs="Times New Roman"/>
+          <w:b/>
+          <w:bCs/>
+          <w:kern w:val="0"/>
+          <w:lang w:eastAsia="it-IT"/>
+          <w14:ligatures w14:val="none"/>
+        </w:rPr>
+        <w:t>Promoter :</w:t>
+      </w:r>
+      <w:r>
+        <w:rPr>
+          <w:rFonts w:eastAsia="Times New Roman" w:cs="Times New Roman"/>
+          <w:kern w:val="0"/>
+          <w:lang w:eastAsia="it-IT"/>
+          <w14:ligatures w14:val="none"/>
+        </w:rPr>
+        <w:t xml:space="preserve"> Creazione e proposta di eventi, gestione delle proprie proposte, comunicazione diretta con i revisori per eventuali modifiche.</w:t>
+      </w:r>
+    </w:p>
+    <w:p>
+      <w:pPr>
+        <w:numPr>
+          <w:ilvl w:val="0"/>
+          <w:numId w:val="11"/>
+        </w:numPr>
+        <w:spacing w:before="100" w:beforeAutospacing="1" w:after="100" w:afterAutospacing="1"/>
+        <w:jc w:val="both"/>
+        <w:rPr>
+          <w:rFonts w:eastAsia="Times New Roman" w:cs="Times New Roman"/>
+          <w:kern w:val="0"/>
+          <w:lang w:eastAsia="it-IT"/>
+          <w14:ligatures w14:val="none"/>
+        </w:rPr>
+      </w:pPr>
+      <w:r>
+        <w:rPr>
+          <w:rFonts w:eastAsia="Times New Roman" w:cs="Times New Roman"/>
+          <w:b/>
+          <w:bCs/>
+          <w:kern w:val="0"/>
+          <w:lang w:eastAsia="it-IT"/>
+          <w14:ligatures w14:val="none"/>
+        </w:rPr>
+        <w:t>Revisore:</w:t>
+      </w:r>
+      <w:r>
+        <w:rPr>
+          <w:rFonts w:eastAsia="Times New Roman" w:cs="Times New Roman"/>
+          <w:kern w:val="0"/>
+          <w:lang w:eastAsia="it-IT"/>
+          <w14:ligatures w14:val="none"/>
+        </w:rPr>
+        <w:t xml:space="preserve"> Valutazione delle proposte di eventi, richiesta di modifiche e approvazione finale per la pubblicazione.</w:t>
+      </w:r>
+    </w:p>
+    <w:p>
+      <w:pPr>
+        <w:numPr>
+          <w:ilvl w:val="0"/>
+          <w:numId w:val="11"/>
+        </w:numPr>
+        <w:spacing w:before="100" w:beforeAutospacing="1" w:after="100" w:afterAutospacing="1"/>
+        <w:jc w:val="both"/>
+        <w:rPr>
+          <w:rFonts w:eastAsia="Times New Roman" w:cs="Times New Roman"/>
+          <w:kern w:val="0"/>
+          <w:lang w:eastAsia="it-IT"/>
+          <w14:ligatures w14:val="none"/>
+        </w:rPr>
+      </w:pPr>
+      <w:r>
+        <w:rPr>
+          <w:rFonts w:eastAsia="Times New Roman" w:cs="Times New Roman"/>
+          <w:b/>
+          <w:bCs/>
+          <w:kern w:val="0"/>
+          <w:lang w:eastAsia="it-IT"/>
+          <w14:ligatures w14:val="none"/>
+        </w:rPr>
+        <w:t>Admin:</w:t>
+      </w:r>
+      <w:r>
+        <w:rPr>
+          <w:rFonts w:eastAsia="Times New Roman" w:cs="Times New Roman"/>
+          <w:kern w:val="0"/>
+          <w:lang w:eastAsia="it-IT"/>
+          <w14:ligatures w14:val="none"/>
+        </w:rPr>
+        <w:t xml:space="preserve"> Supervisione completa sugli eventi, dalle limitazioni delle prenotazioni alla gestione dei profili dei promotori e revisori, assicurando il rispetto degli standard di qualità della piattaforma.</w:t>
+      </w:r>
+    </w:p>
+    <w:p>
+      <w:pPr>
+        <w:jc w:val="both"/>
+        <w:rPr>
+          <w:b/>
+          <w:bCs/>
+        </w:rPr>
+      </w:pPr>
+    </w:p>
+    <w:p>
+      <w:pPr>
+        <w:jc w:val="both"/>
+      </w:pPr>
+      <w:r>
+        <w:rPr>
+          <w:b/>
+          <w:bCs/>
+        </w:rPr>
+        <w:t>Tecnologie Utilizzate</w:t>
+      </w:r>
+      <w:r>
+        <w:t>:</w:t>
+      </w:r>
+    </w:p>
+    <w:p>
+      <w:pPr>
+        <w:numPr>
+          <w:ilvl w:val="0"/>
+          <w:numId w:val="12"/>
         </w:numPr>
         <w:jc w:val="both"/>
       </w:pPr>
+      <w:proofErr w:type="spellStart"/>
       <w:r>
         <w:rPr>
           <w:b/>
           <w:bCs/>
         </w:rPr>
-        <w:t>Visualizzazione degli Eventi</w:t>
-      </w:r>
-      <w:r>
-        <w:t>: L’utente potrà consultare gli eventi proposti, visionarne la descrizione, le date disponibili, gli spazi ospitanti e conoscere gli organizzatori.</w:t>
+        <w:t>Backend</w:t>
+      </w:r>
+      <w:proofErr w:type="spellEnd"/>
+      <w:r>
+        <w:t>: Java Spring per la logica applicativa e l’interfacciamento con il database.</w:t>
       </w:r>
     </w:p>
     <w:p>
       <w:pPr>
         <w:numPr>
           <w:ilvl w:val="0"/>
-          <w:numId w:val="5"/>
+          <w:numId w:val="12"/>
         </w:numPr>
         <w:jc w:val="both"/>
       </w:pPr>
@@ -131,76 +619,71 @@
           <w:b/>
           <w:bCs/>
         </w:rPr>
-        <w:t>Recensioni e Profili Organizzatori</w:t>
-      </w:r>
-      <w:r>
-        <w:t>: Gli utenti potranno leggere e lasciare recensioni sugli eventi a cui hanno preso parte, contribuendo così a una community informata e partecipativa.</w:t>
+        <w:t>Database</w:t>
+      </w:r>
+      <w:r>
+        <w:t>: MySQL per l’archiviazione sicura dei dati relativi a utenti, eventi, prenotazioni e recensioni.</w:t>
       </w:r>
     </w:p>
     <w:p>
       <w:pPr>
         <w:numPr>
           <w:ilvl w:val="0"/>
-          <w:numId w:val="5"/>
+          <w:numId w:val="12"/>
         </w:numPr>
         <w:jc w:val="both"/>
       </w:pPr>
+      <w:proofErr w:type="spellStart"/>
       <w:r>
         <w:rPr>
           <w:b/>
           <w:bCs/>
         </w:rPr>
-        <w:t>Gestione Prenotazioni</w:t>
-      </w:r>
-      <w:r>
-        <w:t>: Sarà possibile prenotare online la partecipazione alle attività proposte.</w:t>
+        <w:t>Frontend</w:t>
+      </w:r>
+      <w:proofErr w:type="spellEnd"/>
+      <w:r>
+        <w:t xml:space="preserve">: </w:t>
+      </w:r>
+      <w:proofErr w:type="spellStart"/>
+      <w:r>
+        <w:t>Angular</w:t>
+      </w:r>
+      <w:proofErr w:type="spellEnd"/>
+      <w:r>
+        <w:t xml:space="preserve"> per la realizzazione dell’interfaccia utente, integrando un’architettura MVC e l’utilizzo di JWT per l’autenticazione e l’autorizzazione.</w:t>
       </w:r>
     </w:p>
     <w:p>
       <w:pPr>
-        <w:numPr>
-          <w:ilvl w:val="0"/>
-          <w:numId w:val="5"/>
-        </w:numPr>
         <w:jc w:val="both"/>
-      </w:pPr>
-      <w:r>
+        <w:textAlignment w:val="baseline"/>
         <w:rPr>
           <w:b/>
           <w:bCs/>
         </w:rPr>
-        <w:t>Ruoli e Gestione Utenti</w:t>
-      </w:r>
-      <w:r>
-        <w:t>: Il sistema distinguerà tra clienti, promotori e amministratori. Gli organizzatori potranno delegare ai promotori parte del lavoro di gestione degli eventi, mentre gli admin avranno facoltà di validare e pubblicare i nuovi eventi, gestire i profili dei promotori, moderare le recensioni ed eventualmente limitare le prenotazioni.</w:t>
-      </w:r>
+      </w:pPr>
     </w:p>
     <w:p>
       <w:pPr>
-        <w:numPr>
-          <w:ilvl w:val="0"/>
-          <w:numId w:val="5"/>
-        </w:numPr>
         <w:jc w:val="both"/>
+        <w:textAlignment w:val="baseline"/>
       </w:pPr>
       <w:r>
         <w:rPr>
           <w:b/>
           <w:bCs/>
         </w:rPr>
-        <w:t>Comunicazione Interna</w:t>
-      </w:r>
-      <w:r>
-        <w:t>: Sarà presente un sistema di messaggistica integrata per favorire la comunicazione tra amministrazione e promotori.</w:t>
+        <w:t>Fascia di voto:</w:t>
+      </w:r>
+      <w:r>
+        <w:t xml:space="preserve"> 25-30</w:t>
       </w:r>
     </w:p>
     <w:p>
       <w:pPr>
         <w:jc w:val="both"/>
-        <w:rPr>
-          <w:b/>
-          <w:bCs/>
-        </w:rPr>
+        <w:textAlignment w:val="baseline"/>
       </w:pPr>
     </w:p>
     <w:p>
@@ -208,233 +691,34 @@
         <w:jc w:val="both"/>
       </w:pPr>
       <w:r>
-        <w:rPr>
-          <w:b/>
-          <w:bCs/>
-        </w:rPr>
-        <w:t xml:space="preserve">Funzionalità per </w:t>
-      </w:r>
-      <w:r>
-        <w:rPr>
-          <w:b/>
-          <w:bCs/>
-        </w:rPr>
-        <w:t>u</w:t>
-      </w:r>
-      <w:r>
-        <w:rPr>
-          <w:b/>
-          <w:bCs/>
-        </w:rPr>
-        <w:t>tenti</w:t>
-      </w:r>
-      <w:r>
-        <w:t>:</w:t>
+        <w:t>Confido che queste modifiche rispecchino le direttive da Lei suggerite e che il progetto ora presenti un valore aggiunto concreto, sia in ambito accademico che professionale.</w:t>
+      </w:r>
+    </w:p>
+    <w:p/>
+    <w:p>
+      <w:r>
+        <w:t>Cordialmente,</w:t>
+      </w:r>
+      <w:r>
+        <w:br/>
+        <w:t>Even Ciampa</w:t>
+      </w:r>
+      <w:r>
+        <w:br/>
       </w:r>
     </w:p>
     <w:p>
-      <w:pPr>
-        <w:numPr>
-          <w:ilvl w:val="0"/>
-          <w:numId w:val="6"/>
-        </w:numPr>
-        <w:jc w:val="both"/>
-      </w:pPr>
-      <w:r>
-        <w:rPr>
-          <w:b/>
-          <w:bCs/>
-        </w:rPr>
-        <w:t>Cliente</w:t>
-      </w:r>
-      <w:r>
-        <w:t>: Registrazione, consultazione eventi, lettura e scrittura recensioni, gestione prenotazioni.</w:t>
+      <w:r>
+        <w:t>Codice persona: 10898431</w:t>
       </w:r>
     </w:p>
     <w:p>
-      <w:pPr>
-        <w:numPr>
-          <w:ilvl w:val="0"/>
-          <w:numId w:val="6"/>
-        </w:numPr>
-        <w:jc w:val="both"/>
-      </w:pPr>
-      <w:r>
-        <w:rPr>
-          <w:b/>
-          <w:bCs/>
-        </w:rPr>
-        <w:t>Promoter / Organizzatori</w:t>
-      </w:r>
-      <w:r>
-        <w:t>: Possibilità di creare e proporre nuovi eventi all’amministrazione, dialogare con l’admin tramite chat e gestire le proprie proposte.</w:t>
-      </w:r>
-    </w:p>
-    <w:p>
-      <w:pPr>
-        <w:numPr>
-          <w:ilvl w:val="0"/>
-          <w:numId w:val="6"/>
-        </w:numPr>
-        <w:jc w:val="both"/>
-      </w:pPr>
-      <w:r>
-        <w:rPr>
-          <w:b/>
-          <w:bCs/>
-        </w:rPr>
-        <w:t>Admin</w:t>
-      </w:r>
-      <w:r>
-        <w:t>: Gestione completa degli eventi (creazione, validazione, pubblicazione), definizione di limitazioni per le prenotazioni, creazione e gestione dei profili dei promoter, moderazione delle recensioni e controllo della qualità dei contenuti.</w:t>
-      </w:r>
-    </w:p>
-    <w:p>
-      <w:pPr>
-        <w:jc w:val="both"/>
-        <w:rPr>
-          <w:b/>
-          <w:bCs/>
-        </w:rPr>
-      </w:pPr>
-    </w:p>
-    <w:p>
-      <w:pPr>
-        <w:jc w:val="both"/>
-      </w:pPr>
-      <w:r>
-        <w:rPr>
-          <w:b/>
-          <w:bCs/>
-        </w:rPr>
-        <w:t>Tecnologie Utilizzate</w:t>
-      </w:r>
-      <w:r>
-        <w:t>:</w:t>
-      </w:r>
-    </w:p>
-    <w:p>
-      <w:pPr>
-        <w:numPr>
-          <w:ilvl w:val="0"/>
-          <w:numId w:val="7"/>
-        </w:numPr>
-        <w:jc w:val="both"/>
-      </w:pPr>
-      <w:proofErr w:type="spellStart"/>
-      <w:r>
-        <w:rPr>
-          <w:b/>
-          <w:bCs/>
-        </w:rPr>
-        <w:t>Backend</w:t>
-      </w:r>
-      <w:proofErr w:type="spellEnd"/>
-      <w:r>
-        <w:t>: Java Spring per la logica applicativa e l’interfacciamento con il database.</w:t>
-      </w:r>
-    </w:p>
-    <w:p>
-      <w:pPr>
-        <w:numPr>
-          <w:ilvl w:val="0"/>
-          <w:numId w:val="7"/>
-        </w:numPr>
-        <w:jc w:val="both"/>
-      </w:pPr>
-      <w:r>
-        <w:rPr>
-          <w:b/>
-          <w:bCs/>
-        </w:rPr>
-        <w:t>Database</w:t>
-      </w:r>
-      <w:r>
-        <w:t>: MySQL per l’archiviazione sicura dei dati relativi a utenti, eventi, prenotazioni e recensioni.</w:t>
-      </w:r>
-    </w:p>
-    <w:p>
-      <w:pPr>
-        <w:numPr>
-          <w:ilvl w:val="0"/>
-          <w:numId w:val="7"/>
-        </w:numPr>
-        <w:jc w:val="both"/>
-      </w:pPr>
-      <w:proofErr w:type="spellStart"/>
-      <w:r>
-        <w:rPr>
-          <w:b/>
-          <w:bCs/>
-        </w:rPr>
-        <w:t>Frontend</w:t>
-      </w:r>
-      <w:proofErr w:type="spellEnd"/>
-      <w:r>
-        <w:t xml:space="preserve">: </w:t>
-      </w:r>
-      <w:proofErr w:type="spellStart"/>
-      <w:r>
-        <w:t>Angular</w:t>
-      </w:r>
-      <w:proofErr w:type="spellEnd"/>
-      <w:r>
-        <w:t xml:space="preserve"> per la realizzazione dell’interfaccia utente, integrando un’architettura MVC e l’utilizzo di JWT per l’autenticazione e l’autorizzazione.</w:t>
-      </w:r>
-    </w:p>
-    <w:p>
-      <w:pPr>
-        <w:jc w:val="both"/>
-        <w:textAlignment w:val="baseline"/>
-      </w:pPr>
-      <w:r>
-        <w:rPr>
-          <w:b/>
-          <w:bCs/>
-        </w:rPr>
-        <w:t>Fascia di voto:</w:t>
-      </w:r>
-      <w:r>
-        <w:t xml:space="preserve"> 25-30</w:t>
-      </w:r>
-    </w:p>
-    <w:p>
-      <w:pPr>
-        <w:jc w:val="both"/>
-        <w:textAlignment w:val="baseline"/>
-      </w:pPr>
-    </w:p>
-    <w:p>
-      <w:r>
-        <w:t>Cordialmente,</w:t>
+      <w:r>
+        <w:t>Matricola: 215384</w:t>
       </w:r>
       <w:r>
         <w:br/>
-        <w:t>Even Ciampa</w:t>
-      </w:r>
-      <w:r>
-        <w:br/>
-      </w:r>
-    </w:p>
-    <w:p>
-      <w:r>
-        <w:t>Codice persona: 10898431</w:t>
-      </w:r>
-    </w:p>
-    <w:p>
-      <w:r>
-        <w:t>Matricola: 215384</w:t>
-      </w:r>
-      <w:r>
-        <w:br/>
-      </w:r>
-      <w:proofErr w:type="gramStart"/>
-      <w:r>
-        <w:t>Email</w:t>
-      </w:r>
-      <w:proofErr w:type="gramEnd"/>
-      <w:r>
-        <w:t>: even.ciampa@mail.polimi.it</w:t>
+        <w:t>Email: even.ciampa@mail.polimi.it</w:t>
       </w:r>
     </w:p>
     <w:sectPr>
@@ -448,8 +732,154 @@
 </file>
 
 <file path=word/numbering.xml><?xml version="1.0" encoding="utf-8"?>
-<w:numbering xmlns:wpc="http://schemas.microsoft.com/office/word/2010/wordprocessingCanvas" xmlns:cx="http://schemas.microsoft.com/office/drawing/2014/chartex" xmlns:cx1="http://schemas.microsoft.com/office/drawing/2015/9/8/chartex" xmlns:cx2="http://schemas.microsoft.com/office/drawing/2015/10/21/chartex" xmlns:cx3="http://schemas.microsoft.com/office/drawing/2016/5/9/chartex" xmlns:cx4="http://schemas.microsoft.com/office/drawing/2016/5/10/chartex" xmlns:cx5="http://schemas.microsoft.com/office/drawing/2016/5/11/chartex" xmlns:cx6="http://schemas.microsoft.com/office/drawing/2016/5/12/chartex" xmlns:cx7="http://schemas.microsoft.com/office/drawing/2016/5/13/chartex" xmlns:cx8="http://schemas.microsoft.com/office/drawing/2016/5/14/chartex" xmlns:mc="http://schemas.openxmlformats.org/markup-compatibility/2006" xmlns:aink="http://schemas.microsoft.com/office/drawing/2016/ink" xmlns:am3d="http://schemas.microsoft.com/office/drawing/2017/model3d" xmlns:o="urn:schemas-microsoft-com:office:office" xmlns:oel="http://schemas.microsoft.com/office/2019/extlst" xmlns:r="http://schemas.openxmlformats.org/officeDocument/2006/relationships" xmlns:m="http://schemas.openxmlformats.org/officeDocument/2006/math" xmlns:v="urn:schemas-microsoft-com:vml" xmlns:wp14="http://schemas.microsoft.com/office/word/2010/wordprocessingDrawing" xmlns:wp="http://schemas.openxmlformats.org/drawingml/2006/wordprocessingDrawing" xmlns:w10="urn:schemas-microsoft-com:office:word" xmlns:w="http://schemas.openxmlformats.org/wordprocessingml/2006/main" xmlns:w14="http://schemas.microsoft.com/office/word/2010/wordml" xmlns:w15="http://schemas.microsoft.com/office/word/2012/wordml" xmlns:w16cex="http://schemas.microsoft.com/office/word/2018/wordml/cex" xmlns:w16cid="http://schemas.microsoft.com/office/word/2016/wordml/cid" xmlns:w16="http://schemas.microsoft.com/office/word/2018/wordml" xmlns:w16du="http://schemas.microsoft.com/office/word/2023/wordml/word16du" xmlns:w16sdtdh="http://schemas.microsoft.com/office/word/2020/wordml/sdtdatahash" xmlns:w16se="http://schemas.microsoft.com/office/word/2015/wordml/symex" xmlns:wpg="http://schemas.microsoft.com/office/word/2010/wordprocessingGroup" xmlns:wpi="http://schemas.microsoft.com/office/word/2010/wordprocessingInk" xmlns:wne="http://schemas.microsoft.com/office/word/2006/wordml" xmlns:wps="http://schemas.microsoft.com/office/word/2010/wordprocessingShape" mc:Ignorable="w14 w15 w16se w16cid w16 w16cex w16sdtdh w16du wp14">
+<w:numbering xmlns:wpc="http://schemas.microsoft.com/office/word/2010/wordprocessingCanvas" xmlns:cx="http://schemas.microsoft.com/office/drawing/2014/chartex" xmlns:cx1="http://schemas.microsoft.com/office/drawing/2015/9/8/chartex" xmlns:cx2="http://schemas.microsoft.com/office/drawing/2015/10/21/chartex" xmlns:cx3="http://schemas.microsoft.com/office/drawing/2016/5/9/chartex" xmlns:cx4="http://schemas.microsoft.com/office/drawing/2016/5/10/chartex" xmlns:cx5="http://schemas.microsoft.com/office/drawing/2016/5/11/chartex" xmlns:cx6="http://schemas.microsoft.com/office/drawing/2016/5/12/chartex" xmlns:cx7="http://schemas.microsoft.com/office/drawing/2016/5/13/chartex" xmlns:cx8="http://schemas.microsoft.com/office/drawing/2016/5/14/chartex" xmlns:mc="http://schemas.openxmlformats.org/markup-compatibility/2006" xmlns:aink="http://schemas.microsoft.com/office/drawing/2016/ink" xmlns:am3d="http://schemas.microsoft.com/office/drawing/2017/model3d" xmlns:o="urn:schemas-microsoft-com:office:office" xmlns:oel="http://schemas.microsoft.com/office/2019/extlst" xmlns:r="http://schemas.openxmlformats.org/officeDocument/2006/relationships" xmlns:m="http://schemas.openxmlformats.org/officeDocument/2006/math" xmlns:v="urn:schemas-microsoft-com:vml" xmlns:wp14="http://schemas.microsoft.com/office/word/2010/wordprocessingDrawing" xmlns:wp="http://schemas.openxmlformats.org/drawingml/2006/wordprocessingDrawing" xmlns:w10="urn:schemas-microsoft-com:office:word" xmlns:w="http://schemas.openxmlformats.org/wordprocessingml/2006/main" xmlns:w14="http://schemas.microsoft.com/office/word/2010/wordml" xmlns:w15="http://schemas.microsoft.com/office/word/2012/wordml" xmlns:w16cex="http://schemas.microsoft.com/office/word/2018/wordml/cex" xmlns:w16cid="http://schemas.microsoft.com/office/word/2016/wordml/cid" xmlns:w16="http://schemas.microsoft.com/office/word/2018/wordml" xmlns:w16du="http://schemas.microsoft.com/office/word/2023/wordml/word16du" xmlns:w16sdtdh="http://schemas.microsoft.com/office/word/2020/wordml/sdtdatahash" xmlns:w16sdtfl="http://schemas.microsoft.com/office/word/2024/wordml/sdtformatlock" xmlns:w16se="http://schemas.microsoft.com/office/word/2015/wordml/symex" xmlns:wpg="http://schemas.microsoft.com/office/word/2010/wordprocessingGroup" xmlns:wpi="http://schemas.microsoft.com/office/word/2010/wordprocessingInk" xmlns:wne="http://schemas.microsoft.com/office/word/2006/wordml" xmlns:wps="http://schemas.microsoft.com/office/word/2010/wordprocessingShape" mc:Ignorable="w14 w15 w16se w16cid w16 w16cex w16sdtdh w16sdtfl w16du wp14">
   <w:abstractNum w:abstractNumId="0" w15:restartNumberingAfterBreak="0">
+    <w:nsid w:val="05BD59AF"/>
+    <w:multiLevelType w:val="multilevel"/>
+    <w:tmpl w:val="D1089EEC"/>
+    <w:lvl w:ilvl="0">
+      <w:start w:val="1"/>
+      <w:numFmt w:val="bullet"/>
+      <w:lvlText w:val=""/>
+      <w:lvlJc w:val="left"/>
+      <w:pPr>
+        <w:ind w:left="720" w:hanging="360"/>
+      </w:pPr>
+      <w:rPr>
+        <w:rFonts w:ascii="Wingdings" w:hAnsi="Wingdings" w:hint="default"/>
+        <w:sz w:val="20"/>
+      </w:rPr>
+    </w:lvl>
+    <w:lvl w:ilvl="1" w:tentative="1">
+      <w:start w:val="1"/>
+      <w:numFmt w:val="bullet"/>
+      <w:lvlText w:val="o"/>
+      <w:lvlJc w:val="left"/>
+      <w:pPr>
+        <w:tabs>
+          <w:tab w:val="num" w:pos="1440"/>
+        </w:tabs>
+        <w:ind w:left="1440" w:hanging="360"/>
+      </w:pPr>
+      <w:rPr>
+        <w:rFonts w:ascii="Courier New" w:hAnsi="Courier New" w:hint="default"/>
+        <w:sz w:val="20"/>
+      </w:rPr>
+    </w:lvl>
+    <w:lvl w:ilvl="2" w:tentative="1">
+      <w:start w:val="1"/>
+      <w:numFmt w:val="bullet"/>
+      <w:lvlText w:val=""/>
+      <w:lvlJc w:val="left"/>
+      <w:pPr>
+        <w:tabs>
+          <w:tab w:val="num" w:pos="2160"/>
+        </w:tabs>
+        <w:ind w:left="2160" w:hanging="360"/>
+      </w:pPr>
+      <w:rPr>
+        <w:rFonts w:ascii="Wingdings" w:hAnsi="Wingdings" w:hint="default"/>
+        <w:sz w:val="20"/>
+      </w:rPr>
+    </w:lvl>
+    <w:lvl w:ilvl="3" w:tentative="1">
+      <w:start w:val="1"/>
+      <w:numFmt w:val="bullet"/>
+      <w:lvlText w:val=""/>
+      <w:lvlJc w:val="left"/>
+      <w:pPr>
+        <w:tabs>
+          <w:tab w:val="num" w:pos="2880"/>
+        </w:tabs>
+        <w:ind w:left="2880" w:hanging="360"/>
+      </w:pPr>
+      <w:rPr>
+        <w:rFonts w:ascii="Wingdings" w:hAnsi="Wingdings" w:hint="default"/>
+        <w:sz w:val="20"/>
+      </w:rPr>
+    </w:lvl>
+    <w:lvl w:ilvl="4" w:tentative="1">
+      <w:start w:val="1"/>
+      <w:numFmt w:val="bullet"/>
+      <w:lvlText w:val=""/>
+      <w:lvlJc w:val="left"/>
+      <w:pPr>
+        <w:tabs>
+          <w:tab w:val="num" w:pos="3600"/>
+        </w:tabs>
+        <w:ind w:left="3600" w:hanging="360"/>
+      </w:pPr>
+      <w:rPr>
+        <w:rFonts w:ascii="Wingdings" w:hAnsi="Wingdings" w:hint="default"/>
+        <w:sz w:val="20"/>
+      </w:rPr>
+    </w:lvl>
+    <w:lvl w:ilvl="5" w:tentative="1">
+      <w:start w:val="1"/>
+      <w:numFmt w:val="bullet"/>
+      <w:lvlText w:val=""/>
+      <w:lvlJc w:val="left"/>
+      <w:pPr>
+        <w:tabs>
+          <w:tab w:val="num" w:pos="4320"/>
+        </w:tabs>
+        <w:ind w:left="4320" w:hanging="360"/>
+      </w:pPr>
+      <w:rPr>
+        <w:rFonts w:ascii="Wingdings" w:hAnsi="Wingdings" w:hint="default"/>
+        <w:sz w:val="20"/>
+      </w:rPr>
+    </w:lvl>
+    <w:lvl w:ilvl="6" w:tentative="1">
+      <w:start w:val="1"/>
+      <w:numFmt w:val="bullet"/>
+      <w:lvlText w:val=""/>
+      <w:lvlJc w:val="left"/>
+      <w:pPr>
+        <w:tabs>
+          <w:tab w:val="num" w:pos="5040"/>
+        </w:tabs>
+        <w:ind w:left="5040" w:hanging="360"/>
+      </w:pPr>
+      <w:rPr>
+        <w:rFonts w:ascii="Wingdings" w:hAnsi="Wingdings" w:hint="default"/>
+        <w:sz w:val="20"/>
+      </w:rPr>
+    </w:lvl>
+    <w:lvl w:ilvl="7" w:tentative="1">
+      <w:start w:val="1"/>
+      <w:numFmt w:val="bullet"/>
+      <w:lvlText w:val=""/>
+      <w:lvlJc w:val="left"/>
+      <w:pPr>
+        <w:tabs>
+          <w:tab w:val="num" w:pos="5760"/>
+        </w:tabs>
+        <w:ind w:left="5760" w:hanging="360"/>
+      </w:pPr>
+      <w:rPr>
+        <w:rFonts w:ascii="Wingdings" w:hAnsi="Wingdings" w:hint="default"/>
+        <w:sz w:val="20"/>
+      </w:rPr>
+    </w:lvl>
+    <w:lvl w:ilvl="8" w:tentative="1">
+      <w:start w:val="1"/>
+      <w:numFmt w:val="bullet"/>
+      <w:lvlText w:val=""/>
+      <w:lvlJc w:val="left"/>
+      <w:pPr>
+        <w:tabs>
+          <w:tab w:val="num" w:pos="6480"/>
+        </w:tabs>
+        <w:ind w:left="6480" w:hanging="360"/>
+      </w:pPr>
+      <w:rPr>
+        <w:rFonts w:ascii="Wingdings" w:hAnsi="Wingdings" w:hint="default"/>
+        <w:sz w:val="20"/>
+      </w:rPr>
+    </w:lvl>
+  </w:abstractNum>
+  <w:abstractNum w:abstractNumId="1" w15:restartNumberingAfterBreak="0">
     <w:nsid w:val="1487338B"/>
     <w:multiLevelType w:val="multilevel"/>
     <w:tmpl w:val="37567108"/>
@@ -598,7 +1028,448 @@
       </w:rPr>
     </w:lvl>
   </w:abstractNum>
-  <w:abstractNum w:abstractNumId="1" w15:restartNumberingAfterBreak="0">
+  <w:abstractNum w:abstractNumId="2" w15:restartNumberingAfterBreak="0">
+    <w:nsid w:val="18E95231"/>
+    <w:multiLevelType w:val="multilevel"/>
+    <w:tmpl w:val="10307A68"/>
+    <w:lvl w:ilvl="0">
+      <w:start w:val="1"/>
+      <w:numFmt w:val="bullet"/>
+      <w:lvlText w:val=""/>
+      <w:lvlJc w:val="left"/>
+      <w:pPr>
+        <w:ind w:left="720" w:hanging="360"/>
+      </w:pPr>
+      <w:rPr>
+        <w:rFonts w:ascii="Wingdings" w:hAnsi="Wingdings" w:hint="default"/>
+        <w:sz w:val="20"/>
+      </w:rPr>
+    </w:lvl>
+    <w:lvl w:ilvl="1" w:tentative="1">
+      <w:start w:val="1"/>
+      <w:numFmt w:val="bullet"/>
+      <w:lvlText w:val="o"/>
+      <w:lvlJc w:val="left"/>
+      <w:pPr>
+        <w:tabs>
+          <w:tab w:val="num" w:pos="1440"/>
+        </w:tabs>
+        <w:ind w:left="1440" w:hanging="360"/>
+      </w:pPr>
+      <w:rPr>
+        <w:rFonts w:ascii="Courier New" w:hAnsi="Courier New" w:hint="default"/>
+        <w:sz w:val="20"/>
+      </w:rPr>
+    </w:lvl>
+    <w:lvl w:ilvl="2" w:tentative="1">
+      <w:start w:val="1"/>
+      <w:numFmt w:val="bullet"/>
+      <w:lvlText w:val=""/>
+      <w:lvlJc w:val="left"/>
+      <w:pPr>
+        <w:tabs>
+          <w:tab w:val="num" w:pos="2160"/>
+        </w:tabs>
+        <w:ind w:left="2160" w:hanging="360"/>
+      </w:pPr>
+      <w:rPr>
+        <w:rFonts w:ascii="Wingdings" w:hAnsi="Wingdings" w:hint="default"/>
+        <w:sz w:val="20"/>
+      </w:rPr>
+    </w:lvl>
+    <w:lvl w:ilvl="3" w:tentative="1">
+      <w:start w:val="1"/>
+      <w:numFmt w:val="bullet"/>
+      <w:lvlText w:val=""/>
+      <w:lvlJc w:val="left"/>
+      <w:pPr>
+        <w:tabs>
+          <w:tab w:val="num" w:pos="2880"/>
+        </w:tabs>
+        <w:ind w:left="2880" w:hanging="360"/>
+      </w:pPr>
+      <w:rPr>
+        <w:rFonts w:ascii="Wingdings" w:hAnsi="Wingdings" w:hint="default"/>
+        <w:sz w:val="20"/>
+      </w:rPr>
+    </w:lvl>
+    <w:lvl w:ilvl="4" w:tentative="1">
+      <w:start w:val="1"/>
+      <w:numFmt w:val="bullet"/>
+      <w:lvlText w:val=""/>
+      <w:lvlJc w:val="left"/>
+      <w:pPr>
+        <w:tabs>
+          <w:tab w:val="num" w:pos="3600"/>
+        </w:tabs>
+        <w:ind w:left="3600" w:hanging="360"/>
+      </w:pPr>
+      <w:rPr>
+        <w:rFonts w:ascii="Wingdings" w:hAnsi="Wingdings" w:hint="default"/>
+        <w:sz w:val="20"/>
+      </w:rPr>
+    </w:lvl>
+    <w:lvl w:ilvl="5" w:tentative="1">
+      <w:start w:val="1"/>
+      <w:numFmt w:val="bullet"/>
+      <w:lvlText w:val=""/>
+      <w:lvlJc w:val="left"/>
+      <w:pPr>
+        <w:tabs>
+          <w:tab w:val="num" w:pos="4320"/>
+        </w:tabs>
+        <w:ind w:left="4320" w:hanging="360"/>
+      </w:pPr>
+      <w:rPr>
+        <w:rFonts w:ascii="Wingdings" w:hAnsi="Wingdings" w:hint="default"/>
+        <w:sz w:val="20"/>
+      </w:rPr>
+    </w:lvl>
+    <w:lvl w:ilvl="6" w:tentative="1">
+      <w:start w:val="1"/>
+      <w:numFmt w:val="bullet"/>
+      <w:lvlText w:val=""/>
+      <w:lvlJc w:val="left"/>
+      <w:pPr>
+        <w:tabs>
+          <w:tab w:val="num" w:pos="5040"/>
+        </w:tabs>
+        <w:ind w:left="5040" w:hanging="360"/>
+      </w:pPr>
+      <w:rPr>
+        <w:rFonts w:ascii="Wingdings" w:hAnsi="Wingdings" w:hint="default"/>
+        <w:sz w:val="20"/>
+      </w:rPr>
+    </w:lvl>
+    <w:lvl w:ilvl="7" w:tentative="1">
+      <w:start w:val="1"/>
+      <w:numFmt w:val="bullet"/>
+      <w:lvlText w:val=""/>
+      <w:lvlJc w:val="left"/>
+      <w:pPr>
+        <w:tabs>
+          <w:tab w:val="num" w:pos="5760"/>
+        </w:tabs>
+        <w:ind w:left="5760" w:hanging="360"/>
+      </w:pPr>
+      <w:rPr>
+        <w:rFonts w:ascii="Wingdings" w:hAnsi="Wingdings" w:hint="default"/>
+        <w:sz w:val="20"/>
+      </w:rPr>
+    </w:lvl>
+    <w:lvl w:ilvl="8" w:tentative="1">
+      <w:start w:val="1"/>
+      <w:numFmt w:val="bullet"/>
+      <w:lvlText w:val=""/>
+      <w:lvlJc w:val="left"/>
+      <w:pPr>
+        <w:tabs>
+          <w:tab w:val="num" w:pos="6480"/>
+        </w:tabs>
+        <w:ind w:left="6480" w:hanging="360"/>
+      </w:pPr>
+      <w:rPr>
+        <w:rFonts w:ascii="Wingdings" w:hAnsi="Wingdings" w:hint="default"/>
+        <w:sz w:val="20"/>
+      </w:rPr>
+    </w:lvl>
+  </w:abstractNum>
+  <w:abstractNum w:abstractNumId="3" w15:restartNumberingAfterBreak="0">
+    <w:nsid w:val="1F827B1D"/>
+    <w:multiLevelType w:val="multilevel"/>
+    <w:tmpl w:val="B25CFCC4"/>
+    <w:lvl w:ilvl="0">
+      <w:start w:val="1"/>
+      <w:numFmt w:val="bullet"/>
+      <w:lvlText w:val=""/>
+      <w:lvlJc w:val="left"/>
+      <w:pPr>
+        <w:tabs>
+          <w:tab w:val="num" w:pos="720"/>
+        </w:tabs>
+        <w:ind w:left="720" w:hanging="360"/>
+      </w:pPr>
+      <w:rPr>
+        <w:rFonts w:ascii="Symbol" w:hAnsi="Symbol" w:hint="default"/>
+        <w:sz w:val="20"/>
+      </w:rPr>
+    </w:lvl>
+    <w:lvl w:ilvl="1" w:tentative="1">
+      <w:start w:val="1"/>
+      <w:numFmt w:val="bullet"/>
+      <w:lvlText w:val="o"/>
+      <w:lvlJc w:val="left"/>
+      <w:pPr>
+        <w:tabs>
+          <w:tab w:val="num" w:pos="1440"/>
+        </w:tabs>
+        <w:ind w:left="1440" w:hanging="360"/>
+      </w:pPr>
+      <w:rPr>
+        <w:rFonts w:ascii="Courier New" w:hAnsi="Courier New" w:hint="default"/>
+        <w:sz w:val="20"/>
+      </w:rPr>
+    </w:lvl>
+    <w:lvl w:ilvl="2" w:tentative="1">
+      <w:start w:val="1"/>
+      <w:numFmt w:val="bullet"/>
+      <w:lvlText w:val=""/>
+      <w:lvlJc w:val="left"/>
+      <w:pPr>
+        <w:tabs>
+          <w:tab w:val="num" w:pos="2160"/>
+        </w:tabs>
+        <w:ind w:left="2160" w:hanging="360"/>
+      </w:pPr>
+      <w:rPr>
+        <w:rFonts w:ascii="Wingdings" w:hAnsi="Wingdings" w:hint="default"/>
+        <w:sz w:val="20"/>
+      </w:rPr>
+    </w:lvl>
+    <w:lvl w:ilvl="3" w:tentative="1">
+      <w:start w:val="1"/>
+      <w:numFmt w:val="bullet"/>
+      <w:lvlText w:val=""/>
+      <w:lvlJc w:val="left"/>
+      <w:pPr>
+        <w:tabs>
+          <w:tab w:val="num" w:pos="2880"/>
+        </w:tabs>
+        <w:ind w:left="2880" w:hanging="360"/>
+      </w:pPr>
+      <w:rPr>
+        <w:rFonts w:ascii="Wingdings" w:hAnsi="Wingdings" w:hint="default"/>
+        <w:sz w:val="20"/>
+      </w:rPr>
+    </w:lvl>
+    <w:lvl w:ilvl="4" w:tentative="1">
+      <w:start w:val="1"/>
+      <w:numFmt w:val="bullet"/>
+      <w:lvlText w:val=""/>
+      <w:lvlJc w:val="left"/>
+      <w:pPr>
+        <w:tabs>
+          <w:tab w:val="num" w:pos="3600"/>
+        </w:tabs>
+        <w:ind w:left="3600" w:hanging="360"/>
+      </w:pPr>
+      <w:rPr>
+        <w:rFonts w:ascii="Wingdings" w:hAnsi="Wingdings" w:hint="default"/>
+        <w:sz w:val="20"/>
+      </w:rPr>
+    </w:lvl>
+    <w:lvl w:ilvl="5" w:tentative="1">
+      <w:start w:val="1"/>
+      <w:numFmt w:val="bullet"/>
+      <w:lvlText w:val=""/>
+      <w:lvlJc w:val="left"/>
+      <w:pPr>
+        <w:tabs>
+          <w:tab w:val="num" w:pos="4320"/>
+        </w:tabs>
+        <w:ind w:left="4320" w:hanging="360"/>
+      </w:pPr>
+      <w:rPr>
+        <w:rFonts w:ascii="Wingdings" w:hAnsi="Wingdings" w:hint="default"/>
+        <w:sz w:val="20"/>
+      </w:rPr>
+    </w:lvl>
+    <w:lvl w:ilvl="6" w:tentative="1">
+      <w:start w:val="1"/>
+      <w:numFmt w:val="bullet"/>
+      <w:lvlText w:val=""/>
+      <w:lvlJc w:val="left"/>
+      <w:pPr>
+        <w:tabs>
+          <w:tab w:val="num" w:pos="5040"/>
+        </w:tabs>
+        <w:ind w:left="5040" w:hanging="360"/>
+      </w:pPr>
+      <w:rPr>
+        <w:rFonts w:ascii="Wingdings" w:hAnsi="Wingdings" w:hint="default"/>
+        <w:sz w:val="20"/>
+      </w:rPr>
+    </w:lvl>
+    <w:lvl w:ilvl="7" w:tentative="1">
+      <w:start w:val="1"/>
+      <w:numFmt w:val="bullet"/>
+      <w:lvlText w:val=""/>
+      <w:lvlJc w:val="left"/>
+      <w:pPr>
+        <w:tabs>
+          <w:tab w:val="num" w:pos="5760"/>
+        </w:tabs>
+        <w:ind w:left="5760" w:hanging="360"/>
+      </w:pPr>
+      <w:rPr>
+        <w:rFonts w:ascii="Wingdings" w:hAnsi="Wingdings" w:hint="default"/>
+        <w:sz w:val="20"/>
+      </w:rPr>
+    </w:lvl>
+    <w:lvl w:ilvl="8" w:tentative="1">
+      <w:start w:val="1"/>
+      <w:numFmt w:val="bullet"/>
+      <w:lvlText w:val=""/>
+      <w:lvlJc w:val="left"/>
+      <w:pPr>
+        <w:tabs>
+          <w:tab w:val="num" w:pos="6480"/>
+        </w:tabs>
+        <w:ind w:left="6480" w:hanging="360"/>
+      </w:pPr>
+      <w:rPr>
+        <w:rFonts w:ascii="Wingdings" w:hAnsi="Wingdings" w:hint="default"/>
+        <w:sz w:val="20"/>
+      </w:rPr>
+    </w:lvl>
+  </w:abstractNum>
+  <w:abstractNum w:abstractNumId="4" w15:restartNumberingAfterBreak="0">
+    <w:nsid w:val="3A227B79"/>
+    <w:multiLevelType w:val="multilevel"/>
+    <w:tmpl w:val="A7DAF3E0"/>
+    <w:lvl w:ilvl="0">
+      <w:start w:val="1"/>
+      <w:numFmt w:val="bullet"/>
+      <w:lvlText w:val=""/>
+      <w:lvlJc w:val="left"/>
+      <w:pPr>
+        <w:ind w:left="720" w:hanging="360"/>
+      </w:pPr>
+      <w:rPr>
+        <w:rFonts w:ascii="Wingdings" w:hAnsi="Wingdings" w:hint="default"/>
+        <w:sz w:val="20"/>
+      </w:rPr>
+    </w:lvl>
+    <w:lvl w:ilvl="1" w:tentative="1">
+      <w:start w:val="1"/>
+      <w:numFmt w:val="bullet"/>
+      <w:lvlText w:val="o"/>
+      <w:lvlJc w:val="left"/>
+      <w:pPr>
+        <w:tabs>
+          <w:tab w:val="num" w:pos="1440"/>
+        </w:tabs>
+        <w:ind w:left="1440" w:hanging="360"/>
+      </w:pPr>
+      <w:rPr>
+        <w:rFonts w:ascii="Courier New" w:hAnsi="Courier New" w:hint="default"/>
+        <w:sz w:val="20"/>
+      </w:rPr>
+    </w:lvl>
+    <w:lvl w:ilvl="2" w:tentative="1">
+      <w:start w:val="1"/>
+      <w:numFmt w:val="bullet"/>
+      <w:lvlText w:val=""/>
+      <w:lvlJc w:val="left"/>
+      <w:pPr>
+        <w:tabs>
+          <w:tab w:val="num" w:pos="2160"/>
+        </w:tabs>
+        <w:ind w:left="2160" w:hanging="360"/>
+      </w:pPr>
+      <w:rPr>
+        <w:rFonts w:ascii="Wingdings" w:hAnsi="Wingdings" w:hint="default"/>
+        <w:sz w:val="20"/>
+      </w:rPr>
+    </w:lvl>
+    <w:lvl w:ilvl="3" w:tentative="1">
+      <w:start w:val="1"/>
+      <w:numFmt w:val="bullet"/>
+      <w:lvlText w:val=""/>
+      <w:lvlJc w:val="left"/>
+      <w:pPr>
+        <w:tabs>
+          <w:tab w:val="num" w:pos="2880"/>
+        </w:tabs>
+        <w:ind w:left="2880" w:hanging="360"/>
+      </w:pPr>
+      <w:rPr>
+        <w:rFonts w:ascii="Wingdings" w:hAnsi="Wingdings" w:hint="default"/>
+        <w:sz w:val="20"/>
+      </w:rPr>
+    </w:lvl>
+    <w:lvl w:ilvl="4" w:tentative="1">
+      <w:start w:val="1"/>
+      <w:numFmt w:val="bullet"/>
+      <w:lvlText w:val=""/>
+      <w:lvlJc w:val="left"/>
+      <w:pPr>
+        <w:tabs>
+          <w:tab w:val="num" w:pos="3600"/>
+        </w:tabs>
+        <w:ind w:left="3600" w:hanging="360"/>
+      </w:pPr>
+      <w:rPr>
+        <w:rFonts w:ascii="Wingdings" w:hAnsi="Wingdings" w:hint="default"/>
+        <w:sz w:val="20"/>
+      </w:rPr>
+    </w:lvl>
+    <w:lvl w:ilvl="5" w:tentative="1">
+      <w:start w:val="1"/>
+      <w:numFmt w:val="bullet"/>
+      <w:lvlText w:val=""/>
+      <w:lvlJc w:val="left"/>
+      <w:pPr>
+        <w:tabs>
+          <w:tab w:val="num" w:pos="4320"/>
+        </w:tabs>
+        <w:ind w:left="4320" w:hanging="360"/>
+      </w:pPr>
+      <w:rPr>
+        <w:rFonts w:ascii="Wingdings" w:hAnsi="Wingdings" w:hint="default"/>
+        <w:sz w:val="20"/>
+      </w:rPr>
+    </w:lvl>
+    <w:lvl w:ilvl="6" w:tentative="1">
+      <w:start w:val="1"/>
+      <w:numFmt w:val="bullet"/>
+      <w:lvlText w:val=""/>
+      <w:lvlJc w:val="left"/>
+      <w:pPr>
+        <w:tabs>
+          <w:tab w:val="num" w:pos="5040"/>
+        </w:tabs>
+        <w:ind w:left="5040" w:hanging="360"/>
+      </w:pPr>
+      <w:rPr>
+        <w:rFonts w:ascii="Wingdings" w:hAnsi="Wingdings" w:hint="default"/>
+        <w:sz w:val="20"/>
+      </w:rPr>
+    </w:lvl>
+    <w:lvl w:ilvl="7" w:tentative="1">
+      <w:start w:val="1"/>
+      <w:numFmt w:val="bullet"/>
+      <w:lvlText w:val=""/>
+      <w:lvlJc w:val="left"/>
+      <w:pPr>
+        <w:tabs>
+          <w:tab w:val="num" w:pos="5760"/>
+        </w:tabs>
+        <w:ind w:left="5760" w:hanging="360"/>
+      </w:pPr>
+      <w:rPr>
+        <w:rFonts w:ascii="Wingdings" w:hAnsi="Wingdings" w:hint="default"/>
+        <w:sz w:val="20"/>
+      </w:rPr>
+    </w:lvl>
+    <w:lvl w:ilvl="8" w:tentative="1">
+      <w:start w:val="1"/>
+      <w:numFmt w:val="bullet"/>
+      <w:lvlText w:val=""/>
+      <w:lvlJc w:val="left"/>
+      <w:pPr>
+        <w:tabs>
+          <w:tab w:val="num" w:pos="6480"/>
+        </w:tabs>
+        <w:ind w:left="6480" w:hanging="360"/>
+      </w:pPr>
+      <w:rPr>
+        <w:rFonts w:ascii="Wingdings" w:hAnsi="Wingdings" w:hint="default"/>
+        <w:sz w:val="20"/>
+      </w:rPr>
+    </w:lvl>
+  </w:abstractNum>
+  <w:abstractNum w:abstractNumId="5" w15:restartNumberingAfterBreak="0">
     <w:nsid w:val="5360622D"/>
     <w:multiLevelType w:val="multilevel"/>
     <w:tmpl w:val="5DB45258"/>
@@ -747,7 +1618,7 @@
       </w:rPr>
     </w:lvl>
   </w:abstractNum>
-  <w:abstractNum w:abstractNumId="2" w15:restartNumberingAfterBreak="0">
+  <w:abstractNum w:abstractNumId="6" w15:restartNumberingAfterBreak="0">
     <w:nsid w:val="583F2B5E"/>
     <w:multiLevelType w:val="multilevel"/>
     <w:tmpl w:val="CC4AB03A"/>
@@ -896,7 +1767,156 @@
       </w:rPr>
     </w:lvl>
   </w:abstractNum>
-  <w:abstractNum w:abstractNumId="3" w15:restartNumberingAfterBreak="0">
+  <w:abstractNum w:abstractNumId="7" w15:restartNumberingAfterBreak="0">
+    <w:nsid w:val="5ED25EE1"/>
+    <w:multiLevelType w:val="multilevel"/>
+    <w:tmpl w:val="2C4E1A30"/>
+    <w:lvl w:ilvl="0">
+      <w:start w:val="1"/>
+      <w:numFmt w:val="bullet"/>
+      <w:lvlText w:val=""/>
+      <w:lvlJc w:val="left"/>
+      <w:pPr>
+        <w:tabs>
+          <w:tab w:val="num" w:pos="720"/>
+        </w:tabs>
+        <w:ind w:left="720" w:hanging="360"/>
+      </w:pPr>
+      <w:rPr>
+        <w:rFonts w:ascii="Symbol" w:hAnsi="Symbol" w:hint="default"/>
+        <w:sz w:val="20"/>
+      </w:rPr>
+    </w:lvl>
+    <w:lvl w:ilvl="1" w:tentative="1">
+      <w:start w:val="1"/>
+      <w:numFmt w:val="bullet"/>
+      <w:lvlText w:val="o"/>
+      <w:lvlJc w:val="left"/>
+      <w:pPr>
+        <w:tabs>
+          <w:tab w:val="num" w:pos="1440"/>
+        </w:tabs>
+        <w:ind w:left="1440" w:hanging="360"/>
+      </w:pPr>
+      <w:rPr>
+        <w:rFonts w:ascii="Courier New" w:hAnsi="Courier New" w:hint="default"/>
+        <w:sz w:val="20"/>
+      </w:rPr>
+    </w:lvl>
+    <w:lvl w:ilvl="2" w:tentative="1">
+      <w:start w:val="1"/>
+      <w:numFmt w:val="bullet"/>
+      <w:lvlText w:val=""/>
+      <w:lvlJc w:val="left"/>
+      <w:pPr>
+        <w:tabs>
+          <w:tab w:val="num" w:pos="2160"/>
+        </w:tabs>
+        <w:ind w:left="2160" w:hanging="360"/>
+      </w:pPr>
+      <w:rPr>
+        <w:rFonts w:ascii="Wingdings" w:hAnsi="Wingdings" w:hint="default"/>
+        <w:sz w:val="20"/>
+      </w:rPr>
+    </w:lvl>
+    <w:lvl w:ilvl="3" w:tentative="1">
+      <w:start w:val="1"/>
+      <w:numFmt w:val="bullet"/>
+      <w:lvlText w:val=""/>
+      <w:lvlJc w:val="left"/>
+      <w:pPr>
+        <w:tabs>
+          <w:tab w:val="num" w:pos="2880"/>
+        </w:tabs>
+        <w:ind w:left="2880" w:hanging="360"/>
+      </w:pPr>
+      <w:rPr>
+        <w:rFonts w:ascii="Wingdings" w:hAnsi="Wingdings" w:hint="default"/>
+        <w:sz w:val="20"/>
+      </w:rPr>
+    </w:lvl>
+    <w:lvl w:ilvl="4" w:tentative="1">
+      <w:start w:val="1"/>
+      <w:numFmt w:val="bullet"/>
+      <w:lvlText w:val=""/>
+      <w:lvlJc w:val="left"/>
+      <w:pPr>
+        <w:tabs>
+          <w:tab w:val="num" w:pos="3600"/>
+        </w:tabs>
+        <w:ind w:left="3600" w:hanging="360"/>
+      </w:pPr>
+      <w:rPr>
+        <w:rFonts w:ascii="Wingdings" w:hAnsi="Wingdings" w:hint="default"/>
+        <w:sz w:val="20"/>
+      </w:rPr>
+    </w:lvl>
+    <w:lvl w:ilvl="5" w:tentative="1">
+      <w:start w:val="1"/>
+      <w:numFmt w:val="bullet"/>
+      <w:lvlText w:val=""/>
+      <w:lvlJc w:val="left"/>
+      <w:pPr>
+        <w:tabs>
+          <w:tab w:val="num" w:pos="4320"/>
+        </w:tabs>
+        <w:ind w:left="4320" w:hanging="360"/>
+      </w:pPr>
+      <w:rPr>
+        <w:rFonts w:ascii="Wingdings" w:hAnsi="Wingdings" w:hint="default"/>
+        <w:sz w:val="20"/>
+      </w:rPr>
+    </w:lvl>
+    <w:lvl w:ilvl="6" w:tentative="1">
+      <w:start w:val="1"/>
+      <w:numFmt w:val="bullet"/>
+      <w:lvlText w:val=""/>
+      <w:lvlJc w:val="left"/>
+      <w:pPr>
+        <w:tabs>
+          <w:tab w:val="num" w:pos="5040"/>
+        </w:tabs>
+        <w:ind w:left="5040" w:hanging="360"/>
+      </w:pPr>
+      <w:rPr>
+        <w:rFonts w:ascii="Wingdings" w:hAnsi="Wingdings" w:hint="default"/>
+        <w:sz w:val="20"/>
+      </w:rPr>
+    </w:lvl>
+    <w:lvl w:ilvl="7" w:tentative="1">
+      <w:start w:val="1"/>
+      <w:numFmt w:val="bullet"/>
+      <w:lvlText w:val=""/>
+      <w:lvlJc w:val="left"/>
+      <w:pPr>
+        <w:tabs>
+          <w:tab w:val="num" w:pos="5760"/>
+        </w:tabs>
+        <w:ind w:left="5760" w:hanging="360"/>
+      </w:pPr>
+      <w:rPr>
+        <w:rFonts w:ascii="Wingdings" w:hAnsi="Wingdings" w:hint="default"/>
+        <w:sz w:val="20"/>
+      </w:rPr>
+    </w:lvl>
+    <w:lvl w:ilvl="8" w:tentative="1">
+      <w:start w:val="1"/>
+      <w:numFmt w:val="bullet"/>
+      <w:lvlText w:val=""/>
+      <w:lvlJc w:val="left"/>
+      <w:pPr>
+        <w:tabs>
+          <w:tab w:val="num" w:pos="6480"/>
+        </w:tabs>
+        <w:ind w:left="6480" w:hanging="360"/>
+      </w:pPr>
+      <w:rPr>
+        <w:rFonts w:ascii="Wingdings" w:hAnsi="Wingdings" w:hint="default"/>
+        <w:sz w:val="20"/>
+      </w:rPr>
+    </w:lvl>
+  </w:abstractNum>
+  <w:abstractNum w:abstractNumId="8" w15:restartNumberingAfterBreak="0">
     <w:nsid w:val="687F1D7D"/>
     <w:multiLevelType w:val="multilevel"/>
     <w:tmpl w:val="070CCE90"/>
@@ -1037,7 +2057,7 @@
       </w:rPr>
     </w:lvl>
   </w:abstractNum>
-  <w:abstractNum w:abstractNumId="4" w15:restartNumberingAfterBreak="0">
+  <w:abstractNum w:abstractNumId="9" w15:restartNumberingAfterBreak="0">
     <w:nsid w:val="6B805D48"/>
     <w:multiLevelType w:val="multilevel"/>
     <w:tmpl w:val="B8505E66"/>
@@ -1186,7 +2206,7 @@
       </w:rPr>
     </w:lvl>
   </w:abstractNum>
-  <w:abstractNum w:abstractNumId="5" w15:restartNumberingAfterBreak="0">
+  <w:abstractNum w:abstractNumId="10" w15:restartNumberingAfterBreak="0">
     <w:nsid w:val="6E2430F5"/>
     <w:multiLevelType w:val="multilevel"/>
     <w:tmpl w:val="C60A2B26"/>
@@ -1335,7 +2355,7 @@
       </w:rPr>
     </w:lvl>
   </w:abstractNum>
-  <w:abstractNum w:abstractNumId="6" w15:restartNumberingAfterBreak="0">
+  <w:abstractNum w:abstractNumId="11" w15:restartNumberingAfterBreak="0">
     <w:nsid w:val="71F92126"/>
     <w:multiLevelType w:val="multilevel"/>
     <w:tmpl w:val="BEAE8A12"/>
@@ -1485,31 +2505,46 @@
     </w:lvl>
   </w:abstractNum>
   <w:num w:numId="1" w16cid:durableId="2098094860">
+    <w:abstractNumId w:val="9"/>
+  </w:num>
+  <w:num w:numId="2" w16cid:durableId="618610149">
+    <w:abstractNumId w:val="6"/>
+  </w:num>
+  <w:num w:numId="3" w16cid:durableId="1866602652">
+    <w:abstractNumId w:val="10"/>
+  </w:num>
+  <w:num w:numId="4" w16cid:durableId="1262104363">
+    <w:abstractNumId w:val="8"/>
+  </w:num>
+  <w:num w:numId="5" w16cid:durableId="1009987477">
+    <w:abstractNumId w:val="5"/>
+  </w:num>
+  <w:num w:numId="6" w16cid:durableId="1404525393">
+    <w:abstractNumId w:val="1"/>
+  </w:num>
+  <w:num w:numId="7" w16cid:durableId="614873656">
+    <w:abstractNumId w:val="11"/>
+  </w:num>
+  <w:num w:numId="8" w16cid:durableId="273901341">
+    <w:abstractNumId w:val="7"/>
+  </w:num>
+  <w:num w:numId="9" w16cid:durableId="1151172138">
+    <w:abstractNumId w:val="3"/>
+  </w:num>
+  <w:num w:numId="10" w16cid:durableId="774057445">
     <w:abstractNumId w:val="4"/>
   </w:num>
-  <w:num w:numId="2" w16cid:durableId="618610149">
+  <w:num w:numId="11" w16cid:durableId="1635258068">
     <w:abstractNumId w:val="2"/>
   </w:num>
-  <w:num w:numId="3" w16cid:durableId="1866602652">
-    <w:abstractNumId w:val="5"/>
-  </w:num>
-  <w:num w:numId="4" w16cid:durableId="1262104363">
-    <w:abstractNumId w:val="3"/>
-  </w:num>
-  <w:num w:numId="5" w16cid:durableId="1009987477">
-    <w:abstractNumId w:val="1"/>
-  </w:num>
-  <w:num w:numId="6" w16cid:durableId="1404525393">
+  <w:num w:numId="12" w16cid:durableId="1487890768">
     <w:abstractNumId w:val="0"/>
-  </w:num>
-  <w:num w:numId="7" w16cid:durableId="614873656">
-    <w:abstractNumId w:val="6"/>
   </w:num>
 </w:numbering>
 </file>
 
 <file path=word/styles.xml><?xml version="1.0" encoding="utf-8"?>
-<w:styles xmlns:mc="http://schemas.openxmlformats.org/markup-compatibility/2006" xmlns:r="http://schemas.openxmlformats.org/officeDocument/2006/relationships" xmlns:w="http://schemas.openxmlformats.org/wordprocessingml/2006/main" xmlns:w14="http://schemas.microsoft.com/office/word/2010/wordml" xmlns:w15="http://schemas.microsoft.com/office/word/2012/wordml" xmlns:w16cex="http://schemas.microsoft.com/office/word/2018/wordml/cex" xmlns:w16cid="http://schemas.microsoft.com/office/word/2016/wordml/cid" xmlns:w16="http://schemas.microsoft.com/office/word/2018/wordml" xmlns:w16du="http://schemas.microsoft.com/office/word/2023/wordml/word16du" xmlns:w16sdtdh="http://schemas.microsoft.com/office/word/2020/wordml/sdtdatahash" xmlns:w16se="http://schemas.microsoft.com/office/word/2015/wordml/symex" mc:Ignorable="w14 w15 w16se w16cid w16 w16cex w16sdtdh w16du">
+<w:styles xmlns:mc="http://schemas.openxmlformats.org/markup-compatibility/2006" xmlns:r="http://schemas.openxmlformats.org/officeDocument/2006/relationships" xmlns:w="http://schemas.openxmlformats.org/wordprocessingml/2006/main" xmlns:w14="http://schemas.microsoft.com/office/word/2010/wordml" xmlns:w15="http://schemas.microsoft.com/office/word/2012/wordml" xmlns:w16cex="http://schemas.microsoft.com/office/word/2018/wordml/cex" xmlns:w16cid="http://schemas.microsoft.com/office/word/2016/wordml/cid" xmlns:w16="http://schemas.microsoft.com/office/word/2018/wordml" xmlns:w16du="http://schemas.microsoft.com/office/word/2023/wordml/word16du" xmlns:w16sdtdh="http://schemas.microsoft.com/office/word/2020/wordml/sdtdatahash" xmlns:w16sdtfl="http://schemas.microsoft.com/office/word/2024/wordml/sdtformatlock" xmlns:w16se="http://schemas.microsoft.com/office/word/2015/wordml/symex" mc:Ignorable="w14 w15 w16se w16cid w16 w16cex w16sdtdh w16sdtfl w16du">
   <w:docDefaults>
     <w:rPrDefault>
       <w:rPr>
@@ -1955,7 +2990,6 @@
     <w:next w:val="Normale"/>
     <w:link w:val="Titolo3Carattere"/>
     <w:uiPriority w:val="9"/>
-    <w:semiHidden/>
     <w:unhideWhenUsed/>
     <w:qFormat/>
     <w:rsid w:val="00007B7B"/>
@@ -2105,6 +3139,7 @@
   <w:style w:type="character" w:default="1" w:styleId="Carpredefinitoparagrafo">
     <w:name w:val="Default Paragraph Font"/>
     <w:uiPriority w:val="1"/>
+    <w:semiHidden/>
     <w:unhideWhenUsed/>
   </w:style>
   <w:style w:type="table" w:default="1" w:styleId="Tabellanormale">
@@ -2160,7 +3195,6 @@
     <w:basedOn w:val="Carpredefinitoparagrafo"/>
     <w:link w:val="Titolo3"/>
     <w:uiPriority w:val="9"/>
-    <w:semiHidden/>
     <w:rsid w:val="00007B7B"/>
     <w:rPr>
       <w:rFonts w:eastAsiaTheme="majorEastAsia" w:cstheme="majorBidi"/>
@@ -2417,6 +3451,33 @@
       <w:smallCaps/>
       <w:color w:val="0F4761" w:themeColor="accent1" w:themeShade="BF"/>
       <w:spacing w:val="5"/>
+    </w:rPr>
+  </w:style>
+  <w:style w:type="character" w:styleId="Enfasigrassetto">
+    <w:name w:val="Strong"/>
+    <w:basedOn w:val="Carpredefinitoparagrafo"/>
+    <w:uiPriority w:val="22"/>
+    <w:qFormat/>
+    <w:rsid w:val="000A387C"/>
+    <w:rPr>
+      <w:b/>
+      <w:bCs/>
+    </w:rPr>
+  </w:style>
+  <w:style w:type="paragraph" w:styleId="NormaleWeb">
+    <w:name w:val="Normal (Web)"/>
+    <w:basedOn w:val="Normale"/>
+    <w:uiPriority w:val="99"/>
+    <w:unhideWhenUsed/>
+    <w:rsid w:val="000A387C"/>
+    <w:pPr>
+      <w:spacing w:before="100" w:beforeAutospacing="1" w:after="100" w:afterAutospacing="1"/>
+    </w:pPr>
+    <w:rPr>
+      <w:rFonts w:ascii="Times New Roman" w:eastAsia="Times New Roman" w:hAnsi="Times New Roman" w:cs="Times New Roman"/>
+      <w:kern w:val="0"/>
+      <w:lang w:eastAsia="it-IT"/>
+      <w14:ligatures w14:val="none"/>
     </w:rPr>
   </w:style>
 </w:styles>

</xml_diff>